<commit_message>
Highlight placeholders to fill in QIP V4 and fix reply threading
- Yellow-highlight all fields the team must fill in (dates, names, scores, baselines, VND amounts)
- Link replies to multi-paragraph reviewer comments to the parent's last paragraph so Word threads them

Co-Authored-By: Claude Opus 5.5 <noreply@anthropic.com>
Claude-Session: https://claude.ai/code/session_017JcaorUSv8h8wU6jdhhRTB
</commit_message>
<xml_diff>
--- a/QIP_V4/QIP_Quan_ly_van_hanh_V4_Clean.docx
+++ b/QIP_V4/QIP_Quan_ly_van_hanh_V4_Clean.docx
@@ -98,18 +98,36 @@
               <w:rPr>
                 <w:highlight w:val="yellow"/>
               </w:rPr>
-              <w:t xml:space="preserve">Mã số: 00x-QIP</w:t>
-            </w:r>
-          </w:p>
-          <w:p>
-            <w:pPr>
-              <w:pStyle w:val="BodytextTable"/>
-            </w:pPr>
+              <w:t xml:space="preserve">Mã số: </w:t>
+            </w:r>
             <w:r>
               <w:rPr>
                 <w:highlight w:val="yellow"/>
               </w:rPr>
-              <w:t xml:space="preserve">Ngày phê duyệt: dd/mm/yyyy</w:t>
+              <w:t xml:space="preserve">00x</w:t>
+            </w:r>
+            <w:r>
+              <w:rPr>
+                <w:highlight w:val="yellow"/>
+              </w:rPr>
+              <w:t xml:space="preserve">-QIP</w:t>
+            </w:r>
+          </w:p>
+          <w:p>
+            <w:pPr>
+              <w:pStyle w:val="BodytextTable"/>
+            </w:pPr>
+            <w:r>
+              <w:rPr>
+                <w:highlight w:val="yellow"/>
+              </w:rPr>
+              <w:t xml:space="preserve">Ngày phê duyệt: </w:t>
+            </w:r>
+            <w:r>
+              <w:rPr>
+                <w:highlight w:val="yellow"/>
+              </w:rPr>
+              <w:t xml:space="preserve">dd/mm/yyyy</w:t>
             </w:r>
           </w:p>
         </w:tc>
@@ -256,6 +274,9 @@
               <w:pStyle w:val="Bodytext3-3"/>
             </w:pPr>
             <w:r>
+              <w:rPr>
+                <w:highlight w:val="yellow"/>
+              </w:rPr>
               <w:t xml:space="preserve">[Họ tên – Thành viên Hội đồng QLCL]</w:t>
             </w:r>
           </w:p>
@@ -382,7 +403,10 @@
               <w:pStyle w:val="Bodytext3-3"/>
             </w:pPr>
             <w:r>
-              <w:t>dd/mm/yyyy</w:t>
+              <w:rPr>
+                <w:highlight w:val="yellow"/>
+              </w:rPr>
+              <w:t xml:space="preserve">dd/mm/yyyy</w:t>
             </w:r>
           </w:p>
         </w:tc>
@@ -946,7 +970,16 @@
         <w:t xml:space="preserve">Tỷ lệ phiếu được xử lý đúng hạn (biến cho Mục tiêu 4): </w:t>
       </w:r>
       <w:r>
-        <w:t xml:space="preserve">số phiếu hoàn tất trong thời hạn cam kết / tổng số phiếu hoàn tất trong kỳ × 100%. Thời gian xử lý tính từ khi phiếu được tiếp nhận đến khi hoàn tất (đóng phiếu); thời hạn cam kết quy định riêng cho từng loại phiếu [bảng thời hạn theo loại phiếu – nhóm dự án bổ sung]. Lộ trình: ≥ 80% trong 3 tháng đầu vận hành, ≥ 90% từ tháng thứ 4 đến ngày 31/12/2026. Báo cáo hằng tháng theo từng loại phiếu;</w:t>
+        <w:t xml:space="preserve">số phiếu hoàn tất trong thời hạn cam kết / tổng số phiếu hoàn tất trong kỳ × 100%. Thời gian xử lý tính từ khi phiếu được tiếp nhận đến khi hoàn tất (đóng phiếu); thời hạn cam kết quy định riêng cho từng loại phiếu </w:t>
+      </w:r>
+      <w:r>
+        <w:rPr>
+          <w:highlight w:val="yellow"/>
+        </w:rPr>
+        <w:t xml:space="preserve">[bảng thời hạn theo loại phiếu – nhóm dự án bổ sung]</w:t>
+      </w:r>
+      <w:r>
+        <w:t xml:space="preserve">. Lộ trình: ≥ 80% trong 3 tháng đầu vận hành, ≥ 90% từ tháng thứ 4 đến ngày 31/12/2026. Báo cáo hằng tháng theo từng loại phiếu;</w:t>
       </w:r>
     </w:p>
     <w:p>
@@ -1041,7 +1074,16 @@
         <w:rPr/>
       </w:pPr>
       <w:r>
-        <w:t xml:space="preserve">Công cụ sử dụng: Động não (thu thập ý kiến), Biểu đồ xương cá (phân nhóm nguyên nhân) và 5 câu hỏi “Tại sao” (truy nguyên nhân gốc rễ). Buổi phân tích ngày [dd/mm/yyyy], thành phần: nhóm dự án và tổ trưởng các tổ vận hành; nguyên nhân gốc rễ được chọn bằng biểu quyết của nhóm.</w:t>
+        <w:t xml:space="preserve">Công cụ sử dụng: Động não (thu thập ý kiến), Biểu đồ xương cá (phân nhóm nguyên nhân) và 5 câu hỏi “Tại sao” (truy nguyên nhân gốc rễ). Buổi phân tích ngày </w:t>
+      </w:r>
+      <w:r>
+        <w:rPr>
+          <w:highlight w:val="yellow"/>
+        </w:rPr>
+        <w:t xml:space="preserve">[dd/mm/yyyy]</w:t>
+      </w:r>
+      <w:r>
+        <w:t xml:space="preserve">, thành phần: nhóm dự án và tổ trưởng các tổ vận hành; nguyên nhân gốc rễ được chọn bằng biểu quyết của nhóm.</w:t>
       </w:r>
     </w:p>
     <w:p>
@@ -1860,7 +1902,43 @@
         <w:rPr/>
       </w:pPr>
       <w:r>
-        <w:t xml:space="preserve">Giá trị nền (trước can thiệp) được trích từ dữ liệu hơn 500 phiếu của V1: tỷ lệ phiếu được tiếp nhận trong vòng 30 phút [___]%; thời gian tiếp nhận trung bình [___]; tỷ lệ phiếu xử lý đúng hạn [___]%; tỷ lệ số hóa phiếu [___]%.</w:t>
+        <w:t xml:space="preserve">Giá trị nền (trước can thiệp) được trích từ dữ liệu hơn 500 phiếu của V1: tỷ lệ phiếu được tiếp nhận trong vòng 30 phút </w:t>
+      </w:r>
+      <w:r>
+        <w:rPr>
+          <w:highlight w:val="yellow"/>
+        </w:rPr>
+        <w:t xml:space="preserve">[___]</w:t>
+      </w:r>
+      <w:r>
+        <w:t xml:space="preserve">%; thời gian tiếp nhận trung bình </w:t>
+      </w:r>
+      <w:r>
+        <w:rPr>
+          <w:highlight w:val="yellow"/>
+        </w:rPr>
+        <w:t xml:space="preserve">[___]</w:t>
+      </w:r>
+      <w:r>
+        <w:t xml:space="preserve">; tỷ lệ phiếu xử lý đúng hạn </w:t>
+      </w:r>
+      <w:r>
+        <w:rPr>
+          <w:highlight w:val="yellow"/>
+        </w:rPr>
+        <w:t xml:space="preserve">[___]</w:t>
+      </w:r>
+      <w:r>
+        <w:t xml:space="preserve">%; tỷ lệ số hóa phiếu </w:t>
+      </w:r>
+      <w:r>
+        <w:rPr>
+          <w:highlight w:val="yellow"/>
+        </w:rPr>
+        <w:t xml:space="preserve">[___]</w:t>
+      </w:r>
+      <w:r>
+        <w:t xml:space="preserve">%.</w:t>
       </w:r>
     </w:p>
     <w:p>
@@ -2225,6 +2303,9 @@
               <w:pStyle w:val="BodytextTable"/>
             </w:pPr>
             <w:r>
+              <w:rPr>
+                <w:highlight w:val="yellow"/>
+              </w:rPr>
               <w:t xml:space="preserve">[ ]</w:t>
             </w:r>
           </w:p>
@@ -2238,6 +2319,9 @@
               <w:pStyle w:val="BodytextTable"/>
             </w:pPr>
             <w:r>
+              <w:rPr>
+                <w:highlight w:val="yellow"/>
+              </w:rPr>
               <w:t xml:space="preserve">[ ]</w:t>
             </w:r>
           </w:p>
@@ -2251,6 +2335,9 @@
               <w:pStyle w:val="BodytextTable"/>
             </w:pPr>
             <w:r>
+              <w:rPr>
+                <w:highlight w:val="yellow"/>
+              </w:rPr>
               <w:t xml:space="preserve">[ ]</w:t>
             </w:r>
           </w:p>
@@ -2264,6 +2351,9 @@
               <w:pStyle w:val="BodytextTable"/>
             </w:pPr>
             <w:r>
+              <w:rPr>
+                <w:highlight w:val="yellow"/>
+              </w:rPr>
               <w:t xml:space="preserve">[ ]</w:t>
             </w:r>
           </w:p>
@@ -2320,6 +2410,9 @@
               <w:pStyle w:val="BodytextTable"/>
             </w:pPr>
             <w:r>
+              <w:rPr>
+                <w:highlight w:val="yellow"/>
+              </w:rPr>
               <w:t xml:space="preserve">[ ]</w:t>
             </w:r>
           </w:p>
@@ -2333,6 +2426,9 @@
               <w:pStyle w:val="BodytextTable"/>
             </w:pPr>
             <w:r>
+              <w:rPr>
+                <w:highlight w:val="yellow"/>
+              </w:rPr>
               <w:t xml:space="preserve">[ ]</w:t>
             </w:r>
           </w:p>
@@ -2346,6 +2442,9 @@
               <w:pStyle w:val="BodytextTable"/>
             </w:pPr>
             <w:r>
+              <w:rPr>
+                <w:highlight w:val="yellow"/>
+              </w:rPr>
               <w:t xml:space="preserve">[ ]</w:t>
             </w:r>
           </w:p>
@@ -2359,6 +2458,9 @@
               <w:pStyle w:val="BodytextTable"/>
             </w:pPr>
             <w:r>
+              <w:rPr>
+                <w:highlight w:val="yellow"/>
+              </w:rPr>
               <w:t xml:space="preserve">[ ]</w:t>
             </w:r>
           </w:p>
@@ -2415,6 +2517,9 @@
               <w:pStyle w:val="BodytextTable"/>
             </w:pPr>
             <w:r>
+              <w:rPr>
+                <w:highlight w:val="yellow"/>
+              </w:rPr>
               <w:t xml:space="preserve">[ ]</w:t>
             </w:r>
           </w:p>
@@ -2428,6 +2533,9 @@
               <w:pStyle w:val="BodytextTable"/>
             </w:pPr>
             <w:r>
+              <w:rPr>
+                <w:highlight w:val="yellow"/>
+              </w:rPr>
               <w:t xml:space="preserve">[ ]</w:t>
             </w:r>
           </w:p>
@@ -2441,6 +2549,9 @@
               <w:pStyle w:val="BodytextTable"/>
             </w:pPr>
             <w:r>
+              <w:rPr>
+                <w:highlight w:val="yellow"/>
+              </w:rPr>
               <w:t xml:space="preserve">[ ]</w:t>
             </w:r>
           </w:p>
@@ -2454,6 +2565,9 @@
               <w:pStyle w:val="BodytextTable"/>
             </w:pPr>
             <w:r>
+              <w:rPr>
+                <w:highlight w:val="yellow"/>
+              </w:rPr>
               <w:t xml:space="preserve">[ ]</w:t>
             </w:r>
           </w:p>
@@ -2510,6 +2624,9 @@
               <w:pStyle w:val="BodytextTable"/>
             </w:pPr>
             <w:r>
+              <w:rPr>
+                <w:highlight w:val="yellow"/>
+              </w:rPr>
               <w:t xml:space="preserve">[ ]</w:t>
             </w:r>
           </w:p>
@@ -2523,6 +2640,9 @@
               <w:pStyle w:val="BodytextTable"/>
             </w:pPr>
             <w:r>
+              <w:rPr>
+                <w:highlight w:val="yellow"/>
+              </w:rPr>
               <w:t xml:space="preserve">[ ]</w:t>
             </w:r>
           </w:p>
@@ -2536,6 +2656,9 @@
               <w:pStyle w:val="BodytextTable"/>
             </w:pPr>
             <w:r>
+              <w:rPr>
+                <w:highlight w:val="yellow"/>
+              </w:rPr>
               <w:t xml:space="preserve">[ ]</w:t>
             </w:r>
           </w:p>
@@ -2549,6 +2672,9 @@
               <w:pStyle w:val="BodytextTable"/>
             </w:pPr>
             <w:r>
+              <w:rPr>
+                <w:highlight w:val="yellow"/>
+              </w:rPr>
               <w:t xml:space="preserve">[ ]</w:t>
             </w:r>
           </w:p>
@@ -2605,6 +2731,9 @@
               <w:pStyle w:val="BodytextTable"/>
             </w:pPr>
             <w:r>
+              <w:rPr>
+                <w:highlight w:val="yellow"/>
+              </w:rPr>
               <w:t xml:space="preserve">[ ]</w:t>
             </w:r>
           </w:p>
@@ -2618,6 +2747,9 @@
               <w:pStyle w:val="BodytextTable"/>
             </w:pPr>
             <w:r>
+              <w:rPr>
+                <w:highlight w:val="yellow"/>
+              </w:rPr>
               <w:t xml:space="preserve">[ ]</w:t>
             </w:r>
           </w:p>
@@ -2631,6 +2763,9 @@
               <w:pStyle w:val="BodytextTable"/>
             </w:pPr>
             <w:r>
+              <w:rPr>
+                <w:highlight w:val="yellow"/>
+              </w:rPr>
               <w:t xml:space="preserve">[ ]</w:t>
             </w:r>
           </w:p>
@@ -2644,6 +2779,9 @@
               <w:pStyle w:val="BodytextTable"/>
             </w:pPr>
             <w:r>
+              <w:rPr>
+                <w:highlight w:val="yellow"/>
+              </w:rPr>
               <w:t xml:space="preserve">[ ]</w:t>
             </w:r>
           </w:p>
@@ -2700,6 +2838,9 @@
               <w:pStyle w:val="BodytextTable"/>
             </w:pPr>
             <w:r>
+              <w:rPr>
+                <w:highlight w:val="yellow"/>
+              </w:rPr>
               <w:t xml:space="preserve">[ ]</w:t>
             </w:r>
           </w:p>
@@ -2713,6 +2854,9 @@
               <w:pStyle w:val="BodytextTable"/>
             </w:pPr>
             <w:r>
+              <w:rPr>
+                <w:highlight w:val="yellow"/>
+              </w:rPr>
               <w:t xml:space="preserve">[ ]</w:t>
             </w:r>
           </w:p>
@@ -2726,6 +2870,9 @@
               <w:pStyle w:val="BodytextTable"/>
             </w:pPr>
             <w:r>
+              <w:rPr>
+                <w:highlight w:val="yellow"/>
+              </w:rPr>
               <w:t xml:space="preserve">[ ]</w:t>
             </w:r>
           </w:p>
@@ -2739,6 +2886,9 @@
               <w:pStyle w:val="BodytextTable"/>
             </w:pPr>
             <w:r>
+              <w:rPr>
+                <w:highlight w:val="yellow"/>
+              </w:rPr>
               <w:t xml:space="preserve">[ ]</w:t>
             </w:r>
           </w:p>
@@ -2795,6 +2945,9 @@
               <w:pStyle w:val="BodytextTable"/>
             </w:pPr>
             <w:r>
+              <w:rPr>
+                <w:highlight w:val="yellow"/>
+              </w:rPr>
               <w:t xml:space="preserve">[ ]</w:t>
             </w:r>
           </w:p>
@@ -2808,6 +2961,9 @@
               <w:pStyle w:val="BodytextTable"/>
             </w:pPr>
             <w:r>
+              <w:rPr>
+                <w:highlight w:val="yellow"/>
+              </w:rPr>
               <w:t xml:space="preserve">[ ]</w:t>
             </w:r>
           </w:p>
@@ -2821,6 +2977,9 @@
               <w:pStyle w:val="BodytextTable"/>
             </w:pPr>
             <w:r>
+              <w:rPr>
+                <w:highlight w:val="yellow"/>
+              </w:rPr>
               <w:t xml:space="preserve">[ ]</w:t>
             </w:r>
           </w:p>
@@ -2834,6 +2993,9 @@
               <w:pStyle w:val="BodytextTable"/>
             </w:pPr>
             <w:r>
+              <w:rPr>
+                <w:highlight w:val="yellow"/>
+              </w:rPr>
               <w:t xml:space="preserve">[ ]</w:t>
             </w:r>
           </w:p>
@@ -2890,6 +3052,9 @@
               <w:pStyle w:val="BodytextTable"/>
             </w:pPr>
             <w:r>
+              <w:rPr>
+                <w:highlight w:val="yellow"/>
+              </w:rPr>
               <w:t xml:space="preserve">[ ]</w:t>
             </w:r>
           </w:p>
@@ -2903,6 +3068,9 @@
               <w:pStyle w:val="BodytextTable"/>
             </w:pPr>
             <w:r>
+              <w:rPr>
+                <w:highlight w:val="yellow"/>
+              </w:rPr>
               <w:t xml:space="preserve">[ ]</w:t>
             </w:r>
           </w:p>
@@ -2916,6 +3084,9 @@
               <w:pStyle w:val="BodytextTable"/>
             </w:pPr>
             <w:r>
+              <w:rPr>
+                <w:highlight w:val="yellow"/>
+              </w:rPr>
               <w:t xml:space="preserve">[ ]</w:t>
             </w:r>
           </w:p>
@@ -2929,6 +3100,9 @@
               <w:pStyle w:val="BodytextTable"/>
             </w:pPr>
             <w:r>
+              <w:rPr>
+                <w:highlight w:val="yellow"/>
+              </w:rPr>
               <w:t xml:space="preserve">[ ]</w:t>
             </w:r>
           </w:p>
@@ -2985,6 +3159,9 @@
               <w:pStyle w:val="BodytextTable"/>
             </w:pPr>
             <w:r>
+              <w:rPr>
+                <w:highlight w:val="yellow"/>
+              </w:rPr>
               <w:t xml:space="preserve">[ ]</w:t>
             </w:r>
           </w:p>
@@ -2998,6 +3175,9 @@
               <w:pStyle w:val="BodytextTable"/>
             </w:pPr>
             <w:r>
+              <w:rPr>
+                <w:highlight w:val="yellow"/>
+              </w:rPr>
               <w:t xml:space="preserve">[ ]</w:t>
             </w:r>
           </w:p>
@@ -3011,6 +3191,9 @@
               <w:pStyle w:val="BodytextTable"/>
             </w:pPr>
             <w:r>
+              <w:rPr>
+                <w:highlight w:val="yellow"/>
+              </w:rPr>
               <w:t xml:space="preserve">[ ]</w:t>
             </w:r>
           </w:p>
@@ -3024,6 +3207,9 @@
               <w:pStyle w:val="BodytextTable"/>
             </w:pPr>
             <w:r>
+              <w:rPr>
+                <w:highlight w:val="yellow"/>
+              </w:rPr>
               <w:t xml:space="preserve">[ ]</w:t>
             </w:r>
           </w:p>
@@ -3339,7 +3525,16 @@
         <w:t xml:space="preserve">Giám sát hoạt động (bổ sung): </w:t>
       </w:r>
       <w:r>
-        <w:t xml:space="preserve">công cụ giám sát tự động kiểm tra hệ thống định kỳ [___] phút/lần, ghi nhận thời gian gián đoạn và cảnh báo quản trị viên (phục vụ Mục tiêu 7).</w:t>
+        <w:t xml:space="preserve">công cụ giám sát tự động kiểm tra hệ thống định kỳ </w:t>
+      </w:r>
+      <w:r>
+        <w:rPr>
+          <w:highlight w:val="yellow"/>
+        </w:rPr>
+        <w:t xml:space="preserve">[___]</w:t>
+      </w:r>
+      <w:r>
+        <w:t xml:space="preserve"> phút/lần, ghi nhận thời gian gián đoạn và cảnh báo quản trị viên (phục vụ Mục tiêu 7).</w:t>
       </w:r>
     </w:p>
     <w:p>
@@ -3617,7 +3812,13 @@
               </w:numPr>
             </w:pPr>
             <w:r>
-              <w:t xml:space="preserve">[Họ tên] – Thành viên Hội đồng QLCL</w:t>
+              <w:rPr>
+                <w:highlight w:val="yellow"/>
+              </w:rPr>
+              <w:t xml:space="preserve">[Họ tên]</w:t>
+            </w:r>
+            <w:r>
+              <w:t xml:space="preserve"> – Thành viên Hội đồng QLCL</w:t>
             </w:r>
           </w:p>
         </w:tc>
@@ -3668,7 +3869,25 @@
         <w:t xml:space="preserve">Giai đoạn 1 </w:t>
       </w:r>
       <w:r>
-        <w:t xml:space="preserve">(2 tuần, [dd/mm/yyyy] – [dd/mm/yyyy])</w:t>
+        <w:t xml:space="preserve">(2 tuần, </w:t>
+      </w:r>
+      <w:r>
+        <w:rPr>
+          <w:highlight w:val="yellow"/>
+        </w:rPr>
+        <w:t xml:space="preserve">[dd/mm/yyyy]</w:t>
+      </w:r>
+      <w:r>
+        <w:t xml:space="preserve"> – </w:t>
+      </w:r>
+      <w:r>
+        <w:rPr>
+          <w:highlight w:val="yellow"/>
+        </w:rPr>
+        <w:t xml:space="preserve">[dd/mm/yyyy]</w:t>
+      </w:r>
+      <w:r>
+        <w:t xml:space="preserve">)</w:t>
       </w:r>
       <w:r>
         <w:t xml:space="preserve">: Khảo sát quy trình, thu thập yêu cầu, </w:t>
@@ -3688,7 +3907,25 @@
         <w:t xml:space="preserve">Giai đoạn 2 </w:t>
       </w:r>
       <w:r>
-        <w:t xml:space="preserve">(6 tuần, [dd/mm/yyyy] – [dd/mm/yyyy])</w:t>
+        <w:t xml:space="preserve">(6 tuần, </w:t>
+      </w:r>
+      <w:r>
+        <w:rPr>
+          <w:highlight w:val="yellow"/>
+        </w:rPr>
+        <w:t xml:space="preserve">[dd/mm/yyyy]</w:t>
+      </w:r>
+      <w:r>
+        <w:t xml:space="preserve"> – </w:t>
+      </w:r>
+      <w:r>
+        <w:rPr>
+          <w:highlight w:val="yellow"/>
+        </w:rPr>
+        <w:t xml:space="preserve">[dd/mm/yyyy]</w:t>
+      </w:r>
+      <w:r>
+        <w:t xml:space="preserve">)</w:t>
       </w:r>
       <w:r>
         <w:t xml:space="preserve">: Phát triển </w:t>
@@ -3708,7 +3945,25 @@
         <w:t xml:space="preserve">Giai đoạn 3 </w:t>
       </w:r>
       <w:r>
-        <w:t xml:space="preserve">(4 tuần, [dd/mm/yyyy] – [dd/mm/yyyy])</w:t>
+        <w:t xml:space="preserve">(4 tuần, </w:t>
+      </w:r>
+      <w:r>
+        <w:rPr>
+          <w:highlight w:val="yellow"/>
+        </w:rPr>
+        <w:t xml:space="preserve">[dd/mm/yyyy]</w:t>
+      </w:r>
+      <w:r>
+        <w:t xml:space="preserve"> – </w:t>
+      </w:r>
+      <w:r>
+        <w:rPr>
+          <w:highlight w:val="yellow"/>
+        </w:rPr>
+        <w:t xml:space="preserve">[dd/mm/yyyy]</w:t>
+      </w:r>
+      <w:r>
+        <w:t xml:space="preserve">)</w:t>
       </w:r>
       <w:r>
         <w:t xml:space="preserve">: Phát triển </w:t>
@@ -3728,7 +3983,25 @@
         <w:t xml:space="preserve">Giai đoạn 4 </w:t>
       </w:r>
       <w:r>
-        <w:t xml:space="preserve">(2 tuần, [dd/mm/yyyy] – [dd/mm/yyyy])</w:t>
+        <w:t xml:space="preserve">(2 tuần, </w:t>
+      </w:r>
+      <w:r>
+        <w:rPr>
+          <w:highlight w:val="yellow"/>
+        </w:rPr>
+        <w:t xml:space="preserve">[dd/mm/yyyy]</w:t>
+      </w:r>
+      <w:r>
+        <w:t xml:space="preserve"> – </w:t>
+      </w:r>
+      <w:r>
+        <w:rPr>
+          <w:highlight w:val="yellow"/>
+        </w:rPr>
+        <w:t xml:space="preserve">[dd/mm/yyyy]</w:t>
+      </w:r>
+      <w:r>
+        <w:t xml:space="preserve">)</w:t>
       </w:r>
       <w:r>
         <w:t xml:space="preserve">: Kiểm thử tích hợp, kiểm thử nghiệm thu cùng các tổ vận hành, đóng gói Docker và triển khai </w:t>
@@ -3748,7 +4021,16 @@
         </w:rPr>
       </w:pPr>
       <w:r>
-        <w:t xml:space="preserve">Giai đoạn 5 ([dd/mm/yyyy] – 31/12/2026):</w:t>
+        <w:t xml:space="preserve">Giai đoạn 5 (</w:t>
+      </w:r>
+      <w:r>
+        <w:rPr>
+          <w:highlight w:val="yellow"/>
+        </w:rPr>
+        <w:t xml:space="preserve">[dd/mm/yyyy]</w:t>
+      </w:r>
+      <w:r>
+        <w:t xml:space="preserve"> – 31/12/2026):</w:t>
       </w:r>
       <w:r>
         <w:t xml:space="preserve"> Vận hành chính thức tại ops.bih-ai.com, đào tạo người dùng, tiếp nhận phản hồi và cải tiến liên tục </w:t>
@@ -3766,7 +4048,25 @@
         <w:rPr/>
       </w:pPr>
       <w:r>
-        <w:t xml:space="preserve">Trong Giai đoạn 5, bổ sung chức năng xác nhận thông báo và chuyển cấp tự động (Mục tiêu 5), công cụ giám sát hoạt động (Mục tiêu 7): [dd/mm/yyyy] – [dd/mm/yyyy];</w:t>
+        <w:t xml:space="preserve">Trong Giai đoạn 5, bổ sung chức năng xác nhận thông báo và chuyển cấp tự động (Mục tiêu 5), công cụ giám sát hoạt động (Mục tiêu 7): </w:t>
+      </w:r>
+      <w:r>
+        <w:rPr>
+          <w:highlight w:val="yellow"/>
+        </w:rPr>
+        <w:t xml:space="preserve">[dd/mm/yyyy]</w:t>
+      </w:r>
+      <w:r>
+        <w:t xml:space="preserve"> – </w:t>
+      </w:r>
+      <w:r>
+        <w:rPr>
+          <w:highlight w:val="yellow"/>
+        </w:rPr>
+        <w:t xml:space="preserve">[dd/mm/yyyy]</w:t>
+      </w:r>
+      <w:r>
+        <w:t xml:space="preserve">;</w:t>
       </w:r>
     </w:p>
     <w:p>
@@ -4126,7 +4426,25 @@
               <w:rPr/>
             </w:pPr>
             <w:r>
-              <w:t xml:space="preserve">880 USD ≈ [__________] đồng (tỷ giá bán ra Vietcombank ngày [dd/mm/yyyy])</w:t>
+              <w:t xml:space="preserve">880 USD ≈ </w:t>
+            </w:r>
+            <w:r>
+              <w:rPr>
+                <w:highlight w:val="yellow"/>
+              </w:rPr>
+              <w:t xml:space="preserve">[__________]</w:t>
+            </w:r>
+            <w:r>
+              <w:t xml:space="preserve"> đồng (tỷ giá bán ra Vietcombank ngày </w:t>
+            </w:r>
+            <w:r>
+              <w:rPr>
+                <w:highlight w:val="yellow"/>
+              </w:rPr>
+              <w:t xml:space="preserve">[dd/mm/yyyy]</w:t>
+            </w:r>
+            <w:r>
+              <w:t xml:space="preserve">)</w:t>
             </w:r>
           </w:p>
         </w:tc>
@@ -4412,7 +4730,20 @@
               <w:rPr>
                 <w:b/>
               </w:rPr>
-              <w:t xml:space="preserve">≈ [__________] đồng</w:t>
+              <w:t xml:space="preserve">≈ </w:t>
+            </w:r>
+            <w:r>
+              <w:rPr>
+                <w:b/>
+                <w:highlight w:val="yellow"/>
+              </w:rPr>
+              <w:t xml:space="preserve">[__________]</w:t>
+            </w:r>
+            <w:r>
+              <w:rPr>
+                <w:b/>
+              </w:rPr>
+              <w:t xml:space="preserve"> đồng</w:t>
             </w:r>
           </w:p>
         </w:tc>
@@ -4602,6 +4933,9 @@
               <w:pStyle w:val="BodytextTable"/>
             </w:pPr>
             <w:r>
+              <w:rPr>
+                <w:highlight w:val="yellow"/>
+              </w:rPr>
               <w:t xml:space="preserve">[dd/mm/yyyy]</w:t>
             </w:r>
           </w:p>
@@ -4674,6 +5008,9 @@
               <w:pStyle w:val="BodytextTable"/>
             </w:pPr>
             <w:r>
+              <w:rPr>
+                <w:highlight w:val="yellow"/>
+              </w:rPr>
               <w:t xml:space="preserve">[dd/mm/yyyy]</w:t>
             </w:r>
           </w:p>
@@ -4746,6 +5083,9 @@
               <w:pStyle w:val="BodytextTable"/>
             </w:pPr>
             <w:r>
+              <w:rPr>
+                <w:highlight w:val="yellow"/>
+              </w:rPr>
               <w:t xml:space="preserve">[dd/mm/yyyy]</w:t>
             </w:r>
           </w:p>
@@ -4818,6 +5158,9 @@
               <w:pStyle w:val="BodytextTable"/>
             </w:pPr>
             <w:r>
+              <w:rPr>
+                <w:highlight w:val="yellow"/>
+              </w:rPr>
               <w:t xml:space="preserve">[dd/mm/yyyy]</w:t>
             </w:r>
           </w:p>
@@ -4890,6 +5233,9 @@
               <w:pStyle w:val="BodytextTable"/>
             </w:pPr>
             <w:r>
+              <w:rPr>
+                <w:highlight w:val="yellow"/>
+              </w:rPr>
               <w:t xml:space="preserve">[dd/mm/yyyy]</w:t>
             </w:r>
           </w:p>
@@ -4962,6 +5308,9 @@
               <w:pStyle w:val="BodytextTable"/>
             </w:pPr>
             <w:r>
+              <w:rPr>
+                <w:highlight w:val="yellow"/>
+              </w:rPr>
               <w:t xml:space="preserve">[dd/mm/yyyy]</w:t>
             </w:r>
           </w:p>
@@ -5034,6 +5383,9 @@
               <w:pStyle w:val="BodytextTable"/>
             </w:pPr>
             <w:r>
+              <w:rPr>
+                <w:highlight w:val="yellow"/>
+              </w:rPr>
               <w:t xml:space="preserve">[dd/mm/yyyy]</w:t>
             </w:r>
           </w:p>
@@ -5106,6 +5458,9 @@
               <w:pStyle w:val="BodytextTable"/>
             </w:pPr>
             <w:r>
+              <w:rPr>
+                <w:highlight w:val="yellow"/>
+              </w:rPr>
               <w:t xml:space="preserve">[dd/mm/yyyy]</w:t>
             </w:r>
           </w:p>
@@ -6642,7 +6997,16 @@
         <w:pStyle w:val="Listbullet-"/>
       </w:pPr>
       <w:r>
-        <w:t xml:space="preserve">Người giám sát: [Họ và tên] – Thành viên Hội đồng Quản lý chất lượng (Phòng QLCL).</w:t>
+        <w:t xml:space="preserve">Người giám sát: </w:t>
+      </w:r>
+      <w:r>
+        <w:rPr>
+          <w:highlight w:val="yellow"/>
+        </w:rPr>
+        <w:t xml:space="preserve">[Họ và tên]</w:t>
+      </w:r>
+      <w:r>
+        <w:t xml:space="preserve"> – Thành viên Hội đồng Quản lý chất lượng (Phòng QLCL).</w:t>
       </w:r>
     </w:p>
     <w:p>
@@ -6912,6 +7276,9 @@
               <w:pStyle w:val="BodytextTable"/>
             </w:pPr>
             <w:r>
+              <w:rPr>
+                <w:highlight w:val="yellow"/>
+              </w:rPr>
               <w:t xml:space="preserve">[ ]</w:t>
             </w:r>
           </w:p>
@@ -7028,6 +7395,9 @@
               <w:pStyle w:val="BodytextTable"/>
             </w:pPr>
             <w:r>
+              <w:rPr>
+                <w:highlight w:val="yellow"/>
+              </w:rPr>
               <w:t xml:space="preserve">[ ]</w:t>
             </w:r>
           </w:p>
@@ -7144,6 +7514,9 @@
               <w:pStyle w:val="BodytextTable"/>
             </w:pPr>
             <w:r>
+              <w:rPr>
+                <w:highlight w:val="yellow"/>
+              </w:rPr>
               <w:t xml:space="preserve">[ ]</w:t>
             </w:r>
           </w:p>
@@ -7260,6 +7633,9 @@
               <w:pStyle w:val="BodytextTable"/>
             </w:pPr>
             <w:r>
+              <w:rPr>
+                <w:highlight w:val="yellow"/>
+              </w:rPr>
               <w:t xml:space="preserve">[ ]</w:t>
             </w:r>
           </w:p>
@@ -7492,6 +7868,9 @@
               <w:pStyle w:val="BodytextTable"/>
             </w:pPr>
             <w:r>
+              <w:rPr>
+                <w:highlight w:val="yellow"/>
+              </w:rPr>
               <w:t xml:space="preserve">[ ]</w:t>
             </w:r>
           </w:p>
@@ -7608,6 +7987,9 @@
               <w:pStyle w:val="BodytextTable"/>
             </w:pPr>
             <w:r>
+              <w:rPr>
+                <w:highlight w:val="yellow"/>
+              </w:rPr>
               <w:t xml:space="preserve">[ ]</w:t>
             </w:r>
           </w:p>
@@ -8148,6 +8530,9 @@
               <w:pStyle w:val="BodytextTable"/>
             </w:pPr>
             <w:r>
+              <w:rPr>
+                <w:highlight w:val="yellow"/>
+              </w:rPr>
               <w:t xml:space="preserve">[ ]</w:t>
             </w:r>
           </w:p>
@@ -8167,6 +8552,9 @@
               <w:pStyle w:val="BodytextTable"/>
             </w:pPr>
             <w:r>
+              <w:rPr>
+                <w:highlight w:val="yellow"/>
+              </w:rPr>
               <w:t xml:space="preserve">[ ]</w:t>
             </w:r>
           </w:p>
@@ -8186,6 +8574,9 @@
               <w:pStyle w:val="BodytextTable"/>
             </w:pPr>
             <w:r>
+              <w:rPr>
+                <w:highlight w:val="yellow"/>
+              </w:rPr>
               <w:t xml:space="preserve">[ ]</w:t>
             </w:r>
           </w:p>
@@ -8395,6 +8786,9 @@
               <w:pStyle w:val="BodytextTable"/>
             </w:pPr>
             <w:r>
+              <w:rPr>
+                <w:highlight w:val="yellow"/>
+              </w:rPr>
               <w:t xml:space="preserve">[ ]</w:t>
             </w:r>
           </w:p>
@@ -8414,6 +8808,9 @@
               <w:pStyle w:val="BodytextTable"/>
             </w:pPr>
             <w:r>
+              <w:rPr>
+                <w:highlight w:val="yellow"/>
+              </w:rPr>
               <w:t xml:space="preserve">[ ]</w:t>
             </w:r>
           </w:p>
@@ -8433,6 +8830,9 @@
               <w:pStyle w:val="BodytextTable"/>
             </w:pPr>
             <w:r>
+              <w:rPr>
+                <w:highlight w:val="yellow"/>
+              </w:rPr>
               <w:t xml:space="preserve">[ ]</w:t>
             </w:r>
           </w:p>
@@ -8642,6 +9042,9 @@
               <w:pStyle w:val="BodytextTable"/>
             </w:pPr>
             <w:r>
+              <w:rPr>
+                <w:highlight w:val="yellow"/>
+              </w:rPr>
               <w:t xml:space="preserve">[ ]</w:t>
             </w:r>
           </w:p>
@@ -8661,6 +9064,9 @@
               <w:pStyle w:val="BodytextTable"/>
             </w:pPr>
             <w:r>
+              <w:rPr>
+                <w:highlight w:val="yellow"/>
+              </w:rPr>
               <w:t xml:space="preserve">[ ]</w:t>
             </w:r>
           </w:p>
@@ -8680,6 +9086,9 @@
               <w:pStyle w:val="BodytextTable"/>
             </w:pPr>
             <w:r>
+              <w:rPr>
+                <w:highlight w:val="yellow"/>
+              </w:rPr>
               <w:t xml:space="preserve">[ ]</w:t>
             </w:r>
           </w:p>
@@ -8889,6 +9298,9 @@
               <w:pStyle w:val="BodytextTable"/>
             </w:pPr>
             <w:r>
+              <w:rPr>
+                <w:highlight w:val="yellow"/>
+              </w:rPr>
               <w:t xml:space="preserve">[ ]</w:t>
             </w:r>
           </w:p>
@@ -8908,6 +9320,9 @@
               <w:pStyle w:val="BodytextTable"/>
             </w:pPr>
             <w:r>
+              <w:rPr>
+                <w:highlight w:val="yellow"/>
+              </w:rPr>
               <w:t xml:space="preserve">[ ]</w:t>
             </w:r>
           </w:p>
@@ -8927,6 +9342,9 @@
               <w:pStyle w:val="BodytextTable"/>
             </w:pPr>
             <w:r>
+              <w:rPr>
+                <w:highlight w:val="yellow"/>
+              </w:rPr>
               <w:t xml:space="preserve">[ ]</w:t>
             </w:r>
           </w:p>
@@ -9068,7 +9486,16 @@
               <w:pStyle w:val="BodytextTable"/>
             </w:pPr>
             <w:r>
-              <w:t xml:space="preserve">880 USD ≈ [______] đồng (Claude Code)</w:t>
+              <w:t xml:space="preserve">880 USD ≈ </w:t>
+            </w:r>
+            <w:r>
+              <w:rPr>
+                <w:highlight w:val="yellow"/>
+              </w:rPr>
+              <w:t xml:space="preserve">[______]</w:t>
+            </w:r>
+            <w:r>
+              <w:t xml:space="preserve"> đồng (Claude Code)</w:t>
             </w:r>
           </w:p>
         </w:tc>
@@ -9140,6 +9567,9 @@
               <w:pStyle w:val="BodytextTable"/>
             </w:pPr>
             <w:r>
+              <w:rPr>
+                <w:highlight w:val="yellow"/>
+              </w:rPr>
               <w:t xml:space="preserve">[ ]</w:t>
             </w:r>
           </w:p>
@@ -9159,6 +9589,9 @@
               <w:pStyle w:val="BodytextTable"/>
             </w:pPr>
             <w:r>
+              <w:rPr>
+                <w:highlight w:val="yellow"/>
+              </w:rPr>
               <w:t xml:space="preserve">[ ]</w:t>
             </w:r>
           </w:p>
@@ -9178,6 +9611,9 @@
               <w:pStyle w:val="BodytextTable"/>
             </w:pPr>
             <w:r>
+              <w:rPr>
+                <w:highlight w:val="yellow"/>
+              </w:rPr>
               <w:t xml:space="preserve">[ ]</w:t>
             </w:r>
           </w:p>
@@ -9388,6 +9824,9 @@
               <w:pStyle w:val="BodytextTable"/>
             </w:pPr>
             <w:r>
+              <w:rPr>
+                <w:highlight w:val="yellow"/>
+              </w:rPr>
               <w:t xml:space="preserve">[ ]</w:t>
             </w:r>
           </w:p>
@@ -9407,6 +9846,9 @@
               <w:pStyle w:val="BodytextTable"/>
             </w:pPr>
             <w:r>
+              <w:rPr>
+                <w:highlight w:val="yellow"/>
+              </w:rPr>
               <w:t xml:space="preserve">[ ]</w:t>
             </w:r>
           </w:p>
@@ -9426,6 +9868,9 @@
               <w:pStyle w:val="BodytextTable"/>
             </w:pPr>
             <w:r>
+              <w:rPr>
+                <w:highlight w:val="yellow"/>
+              </w:rPr>
               <w:t xml:space="preserve">[ ]</w:t>
             </w:r>
           </w:p>
@@ -9635,6 +10080,9 @@
               <w:pStyle w:val="BodytextTable"/>
             </w:pPr>
             <w:r>
+              <w:rPr>
+                <w:highlight w:val="yellow"/>
+              </w:rPr>
               <w:t xml:space="preserve">[ ]</w:t>
             </w:r>
           </w:p>
@@ -9654,6 +10102,9 @@
               <w:pStyle w:val="BodytextTable"/>
             </w:pPr>
             <w:r>
+              <w:rPr>
+                <w:highlight w:val="yellow"/>
+              </w:rPr>
               <w:t xml:space="preserve">[ ]</w:t>
             </w:r>
           </w:p>
@@ -9673,6 +10124,9 @@
               <w:pStyle w:val="BodytextTable"/>
             </w:pPr>
             <w:r>
+              <w:rPr>
+                <w:highlight w:val="yellow"/>
+              </w:rPr>
               <w:t xml:space="preserve">[ ]</w:t>
             </w:r>
           </w:p>
@@ -9882,6 +10336,9 @@
               <w:pStyle w:val="BodytextTable"/>
             </w:pPr>
             <w:r>
+              <w:rPr>
+                <w:highlight w:val="yellow"/>
+              </w:rPr>
               <w:t xml:space="preserve">[ ]</w:t>
             </w:r>
           </w:p>
@@ -9901,6 +10358,9 @@
               <w:pStyle w:val="BodytextTable"/>
             </w:pPr>
             <w:r>
+              <w:rPr>
+                <w:highlight w:val="yellow"/>
+              </w:rPr>
               <w:t xml:space="preserve">[ ]</w:t>
             </w:r>
           </w:p>
@@ -9920,6 +10380,9 @@
               <w:pStyle w:val="BodytextTable"/>
             </w:pPr>
             <w:r>
+              <w:rPr>
+                <w:highlight w:val="yellow"/>
+              </w:rPr>
               <w:t xml:space="preserve">[ ]</w:t>
             </w:r>
           </w:p>
@@ -10131,6 +10594,9 @@
               <w:pStyle w:val="BodytextTable"/>
             </w:pPr>
             <w:r>
+              <w:rPr>
+                <w:highlight w:val="yellow"/>
+              </w:rPr>
               <w:t xml:space="preserve">[ ]</w:t>
             </w:r>
           </w:p>
@@ -10150,6 +10616,9 @@
               <w:pStyle w:val="BodytextTable"/>
             </w:pPr>
             <w:r>
+              <w:rPr>
+                <w:highlight w:val="yellow"/>
+              </w:rPr>
               <w:t xml:space="preserve">[ ]</w:t>
             </w:r>
           </w:p>
@@ -10169,6 +10638,9 @@
               <w:pStyle w:val="BodytextTable"/>
             </w:pPr>
             <w:r>
+              <w:rPr>
+                <w:highlight w:val="yellow"/>
+              </w:rPr>
               <w:t xml:space="preserve">[ ]</w:t>
             </w:r>
           </w:p>
@@ -10378,6 +10850,9 @@
               <w:pStyle w:val="BodytextTable"/>
             </w:pPr>
             <w:r>
+              <w:rPr>
+                <w:highlight w:val="yellow"/>
+              </w:rPr>
               <w:t xml:space="preserve">[ ]</w:t>
             </w:r>
           </w:p>
@@ -10397,6 +10872,9 @@
               <w:pStyle w:val="BodytextTable"/>
             </w:pPr>
             <w:r>
+              <w:rPr>
+                <w:highlight w:val="yellow"/>
+              </w:rPr>
               <w:t xml:space="preserve">[ ]</w:t>
             </w:r>
           </w:p>
@@ -10416,6 +10894,9 @@
               <w:pStyle w:val="BodytextTable"/>
             </w:pPr>
             <w:r>
+              <w:rPr>
+                <w:highlight w:val="yellow"/>
+              </w:rPr>
               <w:t xml:space="preserve">[ ]</w:t>
             </w:r>
           </w:p>
@@ -10625,6 +11106,9 @@
               <w:pStyle w:val="BodytextTable"/>
             </w:pPr>
             <w:r>
+              <w:rPr>
+                <w:highlight w:val="yellow"/>
+              </w:rPr>
               <w:t xml:space="preserve">[ ]</w:t>
             </w:r>
           </w:p>
@@ -10644,6 +11128,9 @@
               <w:pStyle w:val="BodytextTable"/>
             </w:pPr>
             <w:r>
+              <w:rPr>
+                <w:highlight w:val="yellow"/>
+              </w:rPr>
               <w:t xml:space="preserve">[ ]</w:t>
             </w:r>
           </w:p>
@@ -10663,6 +11150,9 @@
               <w:pStyle w:val="BodytextTable"/>
             </w:pPr>
             <w:r>
+              <w:rPr>
+                <w:highlight w:val="yellow"/>
+              </w:rPr>
               <w:t xml:space="preserve">[ ]</w:t>
             </w:r>
           </w:p>
@@ -10874,6 +11364,9 @@
               <w:pStyle w:val="BodytextTable"/>
             </w:pPr>
             <w:r>
+              <w:rPr>
+                <w:highlight w:val="yellow"/>
+              </w:rPr>
               <w:t xml:space="preserve">[ ]</w:t>
             </w:r>
           </w:p>
@@ -10893,6 +11386,9 @@
               <w:pStyle w:val="BodytextTable"/>
             </w:pPr>
             <w:r>
+              <w:rPr>
+                <w:highlight w:val="yellow"/>
+              </w:rPr>
               <w:t xml:space="preserve">[ ]</w:t>
             </w:r>
           </w:p>
@@ -10912,6 +11408,9 @@
               <w:pStyle w:val="BodytextTable"/>
             </w:pPr>
             <w:r>
+              <w:rPr>
+                <w:highlight w:val="yellow"/>
+              </w:rPr>
               <w:t xml:space="preserve">[ ]</w:t>
             </w:r>
           </w:p>
@@ -11128,6 +11627,9 @@
               <w:pStyle w:val="BodytextTable"/>
             </w:pPr>
             <w:r>
+              <w:rPr>
+                <w:highlight w:val="yellow"/>
+              </w:rPr>
               <w:t xml:space="preserve">[ ]</w:t>
             </w:r>
           </w:p>
@@ -11147,6 +11649,9 @@
               <w:pStyle w:val="BodytextTable"/>
             </w:pPr>
             <w:r>
+              <w:rPr>
+                <w:highlight w:val="yellow"/>
+              </w:rPr>
               <w:t xml:space="preserve">[ ]</w:t>
             </w:r>
           </w:p>
@@ -11166,6 +11671,9 @@
               <w:pStyle w:val="BodytextTable"/>
             </w:pPr>
             <w:r>
+              <w:rPr>
+                <w:highlight w:val="yellow"/>
+              </w:rPr>
               <w:t xml:space="preserve">[ ]</w:t>
             </w:r>
           </w:p>
@@ -11386,6 +11894,9 @@
               <w:pStyle w:val="BodytextTable"/>
             </w:pPr>
             <w:r>
+              <w:rPr>
+                <w:highlight w:val="yellow"/>
+              </w:rPr>
               <w:t xml:space="preserve">[ ]</w:t>
             </w:r>
           </w:p>
@@ -11405,6 +11916,9 @@
               <w:pStyle w:val="BodytextTable"/>
             </w:pPr>
             <w:r>
+              <w:rPr>
+                <w:highlight w:val="yellow"/>
+              </w:rPr>
               <w:t xml:space="preserve">[ ]</w:t>
             </w:r>
           </w:p>
@@ -11424,6 +11938,9 @@
               <w:pStyle w:val="BodytextTable"/>
             </w:pPr>
             <w:r>
+              <w:rPr>
+                <w:highlight w:val="yellow"/>
+              </w:rPr>
               <w:t xml:space="preserve">[ ]</w:t>
             </w:r>
           </w:p>
@@ -12869,7 +13386,7 @@
   <w15:commentEx w15:paraId="5B96DF1E" w15:paraIdParent="3DC4E1E4" w15:done="0"/>
   <w15:commentEx w15:paraId="52D3F917" w15:paraIdParent="76162A12" w15:done="0"/>
   <w15:commentEx w15:paraId="7D81F59D" w15:paraIdParent="2EDD7D98" w15:done="0"/>
-  <w15:commentEx w15:paraId="1D54DB8A" w15:paraIdParent="6CF0F6CE" w15:done="0"/>
+  <w15:commentEx w15:paraId="1D54DB8A" w15:paraIdParent="24FE8ACD" w15:done="0"/>
   <w15:commentEx w15:paraId="3C919BDD" w15:paraIdParent="3EAAC654" w15:done="0"/>
   <w15:commentEx w15:paraId="64E8F544" w15:paraIdParent="1F665ED1" w15:done="0"/>
   <w15:commentEx w15:paraId="2171B2E0" w15:paraIdParent="6C01E810" w15:done="0"/>
@@ -12884,9 +13401,9 @@
   <w15:commentEx w15:paraId="2FFC5390" w15:paraIdParent="205463C8" w15:done="0"/>
   <w15:commentEx w15:paraId="2B9D0190" w15:paraIdParent="3662EA68" w15:done="0"/>
   <w15:commentEx w15:paraId="6261C6F9" w15:paraIdParent="3F19B588" w15:done="0"/>
-  <w15:commentEx w15:paraId="50AFA4F7" w15:paraIdParent="7723824E" w15:done="0"/>
-  <w15:commentEx w15:paraId="0332D75E" w15:paraIdParent="17D6E993" w15:done="0"/>
-  <w15:commentEx w15:paraId="75F665D8" w15:paraIdParent="269B83C6" w15:done="0"/>
+  <w15:commentEx w15:paraId="50AFA4F7" w15:paraIdParent="2FF4C1F6" w15:done="0"/>
+  <w15:commentEx w15:paraId="0332D75E" w15:paraIdParent="2BF8E15C" w15:done="0"/>
+  <w15:commentEx w15:paraId="75F665D8" w15:paraIdParent="785F4A89" w15:done="0"/>
   <w15:commentEx w15:paraId="1BBFF742" w15:paraIdParent="2D91FA21" w15:done="0"/>
   <w15:commentEx w15:paraId="42199459" w15:paraIdParent="18F1CB84" w15:done="0"/>
 </w15:commentsEx>

</xml_diff>

<commit_message>
Fill derivable placeholders in QIP V4
- Proposed solution scores, phase/Gantt/training dates, monitoring interval, VND cost (Vietcombank 02/10/2026)
- Filled values highlighted green for review; data only the team has stays yellow

Co-Authored-By: Claude Opus 5.5 <noreply@anthropic.com>
Claude-Session: https://claude.ai/code/session_017JcaorUSv8h8wU6jdhhRTB
</commit_message>
<xml_diff>
--- a/QIP_V4/QIP_Quan_ly_van_hanh_V4_Clean.docx
+++ b/QIP_V4/QIP_Quan_ly_van_hanh_V4_Clean.docx
@@ -102,9 +102,9 @@
             </w:r>
             <w:r>
               <w:rPr>
-                <w:highlight w:val="yellow"/>
+                <w:highlight w:val="green"/>
               </w:rPr>
-              <w:t xml:space="preserve">00x</w:t>
+              <w:t xml:space="preserve">021</w:t>
             </w:r>
             <w:r>
               <w:rPr>
@@ -404,9 +404,9 @@
             </w:pPr>
             <w:r>
               <w:rPr>
-                <w:highlight w:val="yellow"/>
+                <w:highlight w:val="green"/>
               </w:rPr>
-              <w:t xml:space="preserve">dd/mm/yyyy</w:t>
+              <w:t xml:space="preserve">31/12/2026</w:t>
             </w:r>
           </w:p>
         </w:tc>
@@ -2304,9 +2304,9 @@
             </w:pPr>
             <w:r>
               <w:rPr>
-                <w:highlight w:val="yellow"/>
+                <w:highlight w:val="green"/>
               </w:rPr>
-              <w:t xml:space="preserve">[ ]</w:t>
+              <w:t xml:space="preserve">5</w:t>
             </w:r>
           </w:p>
         </w:tc>
@@ -2320,9 +2320,9 @@
             </w:pPr>
             <w:r>
               <w:rPr>
-                <w:highlight w:val="yellow"/>
+                <w:highlight w:val="green"/>
               </w:rPr>
-              <w:t xml:space="preserve">[ ]</w:t>
+              <w:t xml:space="preserve">4</w:t>
             </w:r>
           </w:p>
         </w:tc>
@@ -2336,9 +2336,9 @@
             </w:pPr>
             <w:r>
               <w:rPr>
-                <w:highlight w:val="yellow"/>
+                <w:highlight w:val="green"/>
               </w:rPr>
-              <w:t xml:space="preserve">[ ]</w:t>
+              <w:t xml:space="preserve">20</w:t>
             </w:r>
           </w:p>
         </w:tc>
@@ -2352,9 +2352,9 @@
             </w:pPr>
             <w:r>
               <w:rPr>
-                <w:highlight w:val="yellow"/>
+                <w:highlight w:val="green"/>
               </w:rPr>
-              <w:t xml:space="preserve">[ ]</w:t>
+              <w:t xml:space="preserve">Có</w:t>
             </w:r>
           </w:p>
         </w:tc>
@@ -2411,9 +2411,9 @@
             </w:pPr>
             <w:r>
               <w:rPr>
-                <w:highlight w:val="yellow"/>
+                <w:highlight w:val="green"/>
               </w:rPr>
-              <w:t xml:space="preserve">[ ]</w:t>
+              <w:t xml:space="preserve">5</w:t>
             </w:r>
           </w:p>
         </w:tc>
@@ -2427,9 +2427,9 @@
             </w:pPr>
             <w:r>
               <w:rPr>
-                <w:highlight w:val="yellow"/>
+                <w:highlight w:val="green"/>
               </w:rPr>
-              <w:t xml:space="preserve">[ ]</w:t>
+              <w:t xml:space="preserve">4</w:t>
             </w:r>
           </w:p>
         </w:tc>
@@ -2443,9 +2443,9 @@
             </w:pPr>
             <w:r>
               <w:rPr>
-                <w:highlight w:val="yellow"/>
+                <w:highlight w:val="green"/>
               </w:rPr>
-              <w:t xml:space="preserve">[ ]</w:t>
+              <w:t xml:space="preserve">20</w:t>
             </w:r>
           </w:p>
         </w:tc>
@@ -2459,9 +2459,9 @@
             </w:pPr>
             <w:r>
               <w:rPr>
-                <w:highlight w:val="yellow"/>
+                <w:highlight w:val="green"/>
               </w:rPr>
-              <w:t xml:space="preserve">[ ]</w:t>
+              <w:t xml:space="preserve">Có</w:t>
             </w:r>
           </w:p>
         </w:tc>
@@ -2518,9 +2518,9 @@
             </w:pPr>
             <w:r>
               <w:rPr>
-                <w:highlight w:val="yellow"/>
+                <w:highlight w:val="green"/>
               </w:rPr>
-              <w:t xml:space="preserve">[ ]</w:t>
+              <w:t xml:space="preserve">5</w:t>
             </w:r>
           </w:p>
         </w:tc>
@@ -2534,9 +2534,9 @@
             </w:pPr>
             <w:r>
               <w:rPr>
-                <w:highlight w:val="yellow"/>
+                <w:highlight w:val="green"/>
               </w:rPr>
-              <w:t xml:space="preserve">[ ]</w:t>
+              <w:t xml:space="preserve">4</w:t>
             </w:r>
           </w:p>
         </w:tc>
@@ -2550,9 +2550,9 @@
             </w:pPr>
             <w:r>
               <w:rPr>
-                <w:highlight w:val="yellow"/>
+                <w:highlight w:val="green"/>
               </w:rPr>
-              <w:t xml:space="preserve">[ ]</w:t>
+              <w:t xml:space="preserve">20</w:t>
             </w:r>
           </w:p>
         </w:tc>
@@ -2566,9 +2566,9 @@
             </w:pPr>
             <w:r>
               <w:rPr>
-                <w:highlight w:val="yellow"/>
+                <w:highlight w:val="green"/>
               </w:rPr>
-              <w:t xml:space="preserve">[ ]</w:t>
+              <w:t xml:space="preserve">Có</w:t>
             </w:r>
           </w:p>
         </w:tc>
@@ -2625,9 +2625,9 @@
             </w:pPr>
             <w:r>
               <w:rPr>
-                <w:highlight w:val="yellow"/>
+                <w:highlight w:val="green"/>
               </w:rPr>
-              <w:t xml:space="preserve">[ ]</w:t>
+              <w:t xml:space="preserve">5</w:t>
             </w:r>
           </w:p>
         </w:tc>
@@ -2641,9 +2641,9 @@
             </w:pPr>
             <w:r>
               <w:rPr>
-                <w:highlight w:val="yellow"/>
+                <w:highlight w:val="green"/>
               </w:rPr>
-              <w:t xml:space="preserve">[ ]</w:t>
+              <w:t xml:space="preserve">5</w:t>
             </w:r>
           </w:p>
         </w:tc>
@@ -2657,9 +2657,9 @@
             </w:pPr>
             <w:r>
               <w:rPr>
-                <w:highlight w:val="yellow"/>
+                <w:highlight w:val="green"/>
               </w:rPr>
-              <w:t xml:space="preserve">[ ]</w:t>
+              <w:t xml:space="preserve">25</w:t>
             </w:r>
           </w:p>
         </w:tc>
@@ -2673,9 +2673,9 @@
             </w:pPr>
             <w:r>
               <w:rPr>
-                <w:highlight w:val="yellow"/>
+                <w:highlight w:val="green"/>
               </w:rPr>
-              <w:t xml:space="preserve">[ ]</w:t>
+              <w:t xml:space="preserve">Có</w:t>
             </w:r>
           </w:p>
         </w:tc>
@@ -2732,9 +2732,9 @@
             </w:pPr>
             <w:r>
               <w:rPr>
-                <w:highlight w:val="yellow"/>
+                <w:highlight w:val="green"/>
               </w:rPr>
-              <w:t xml:space="preserve">[ ]</w:t>
+              <w:t xml:space="preserve">4</w:t>
             </w:r>
           </w:p>
         </w:tc>
@@ -2748,9 +2748,9 @@
             </w:pPr>
             <w:r>
               <w:rPr>
-                <w:highlight w:val="yellow"/>
+                <w:highlight w:val="green"/>
               </w:rPr>
-              <w:t xml:space="preserve">[ ]</w:t>
+              <w:t xml:space="preserve">5</w:t>
             </w:r>
           </w:p>
         </w:tc>
@@ -2764,9 +2764,9 @@
             </w:pPr>
             <w:r>
               <w:rPr>
-                <w:highlight w:val="yellow"/>
+                <w:highlight w:val="green"/>
               </w:rPr>
-              <w:t xml:space="preserve">[ ]</w:t>
+              <w:t xml:space="preserve">20</w:t>
             </w:r>
           </w:p>
         </w:tc>
@@ -2780,9 +2780,9 @@
             </w:pPr>
             <w:r>
               <w:rPr>
-                <w:highlight w:val="yellow"/>
+                <w:highlight w:val="green"/>
               </w:rPr>
-              <w:t xml:space="preserve">[ ]</w:t>
+              <w:t xml:space="preserve">Có</w:t>
             </w:r>
           </w:p>
         </w:tc>
@@ -2839,9 +2839,9 @@
             </w:pPr>
             <w:r>
               <w:rPr>
-                <w:highlight w:val="yellow"/>
+                <w:highlight w:val="green"/>
               </w:rPr>
-              <w:t xml:space="preserve">[ ]</w:t>
+              <w:t xml:space="preserve">4</w:t>
             </w:r>
           </w:p>
         </w:tc>
@@ -2855,9 +2855,9 @@
             </w:pPr>
             <w:r>
               <w:rPr>
-                <w:highlight w:val="yellow"/>
+                <w:highlight w:val="green"/>
               </w:rPr>
-              <w:t xml:space="preserve">[ ]</w:t>
+              <w:t xml:space="preserve">3</w:t>
             </w:r>
           </w:p>
         </w:tc>
@@ -2871,9 +2871,9 @@
             </w:pPr>
             <w:r>
               <w:rPr>
-                <w:highlight w:val="yellow"/>
+                <w:highlight w:val="green"/>
               </w:rPr>
-              <w:t xml:space="preserve">[ ]</w:t>
+              <w:t xml:space="preserve">12</w:t>
             </w:r>
           </w:p>
         </w:tc>
@@ -2887,9 +2887,9 @@
             </w:pPr>
             <w:r>
               <w:rPr>
-                <w:highlight w:val="yellow"/>
+                <w:highlight w:val="green"/>
               </w:rPr>
-              <w:t xml:space="preserve">[ ]</w:t>
+              <w:t xml:space="preserve">Có</w:t>
             </w:r>
           </w:p>
         </w:tc>
@@ -2946,9 +2946,9 @@
             </w:pPr>
             <w:r>
               <w:rPr>
-                <w:highlight w:val="yellow"/>
+                <w:highlight w:val="green"/>
               </w:rPr>
-              <w:t xml:space="preserve">[ ]</w:t>
+              <w:t xml:space="preserve">4</w:t>
             </w:r>
           </w:p>
         </w:tc>
@@ -2962,9 +2962,9 @@
             </w:pPr>
             <w:r>
               <w:rPr>
-                <w:highlight w:val="yellow"/>
+                <w:highlight w:val="green"/>
               </w:rPr>
-              <w:t xml:space="preserve">[ ]</w:t>
+              <w:t xml:space="preserve">4</w:t>
             </w:r>
           </w:p>
         </w:tc>
@@ -2978,9 +2978,9 @@
             </w:pPr>
             <w:r>
               <w:rPr>
-                <w:highlight w:val="yellow"/>
+                <w:highlight w:val="green"/>
               </w:rPr>
-              <w:t xml:space="preserve">[ ]</w:t>
+              <w:t xml:space="preserve">16</w:t>
             </w:r>
           </w:p>
         </w:tc>
@@ -2994,9 +2994,9 @@
             </w:pPr>
             <w:r>
               <w:rPr>
-                <w:highlight w:val="yellow"/>
+                <w:highlight w:val="green"/>
               </w:rPr>
-              <w:t xml:space="preserve">[ ]</w:t>
+              <w:t xml:space="preserve">Có</w:t>
             </w:r>
           </w:p>
         </w:tc>
@@ -3053,9 +3053,9 @@
             </w:pPr>
             <w:r>
               <w:rPr>
-                <w:highlight w:val="yellow"/>
+                <w:highlight w:val="green"/>
               </w:rPr>
-              <w:t xml:space="preserve">[ ]</w:t>
+              <w:t xml:space="preserve">4</w:t>
             </w:r>
           </w:p>
         </w:tc>
@@ -3069,9 +3069,9 @@
             </w:pPr>
             <w:r>
               <w:rPr>
-                <w:highlight w:val="yellow"/>
+                <w:highlight w:val="green"/>
               </w:rPr>
-              <w:t xml:space="preserve">[ ]</w:t>
+              <w:t xml:space="preserve">2</w:t>
             </w:r>
           </w:p>
         </w:tc>
@@ -3085,9 +3085,9 @@
             </w:pPr>
             <w:r>
               <w:rPr>
-                <w:highlight w:val="yellow"/>
+                <w:highlight w:val="green"/>
               </w:rPr>
-              <w:t xml:space="preserve">[ ]</w:t>
+              <w:t xml:space="preserve">8</w:t>
             </w:r>
           </w:p>
         </w:tc>
@@ -3101,9 +3101,9 @@
             </w:pPr>
             <w:r>
               <w:rPr>
-                <w:highlight w:val="yellow"/>
+                <w:highlight w:val="green"/>
               </w:rPr>
-              <w:t xml:space="preserve">[ ]</w:t>
+              <w:t xml:space="preserve">Không</w:t>
             </w:r>
           </w:p>
         </w:tc>
@@ -3160,9 +3160,9 @@
             </w:pPr>
             <w:r>
               <w:rPr>
-                <w:highlight w:val="yellow"/>
+                <w:highlight w:val="green"/>
               </w:rPr>
-              <w:t xml:space="preserve">[ ]</w:t>
+              <w:t xml:space="preserve">2</w:t>
             </w:r>
           </w:p>
         </w:tc>
@@ -3176,9 +3176,9 @@
             </w:pPr>
             <w:r>
               <w:rPr>
-                <w:highlight w:val="yellow"/>
+                <w:highlight w:val="green"/>
               </w:rPr>
-              <w:t xml:space="preserve">[ ]</w:t>
+              <w:t xml:space="preserve">3</w:t>
             </w:r>
           </w:p>
         </w:tc>
@@ -3192,9 +3192,9 @@
             </w:pPr>
             <w:r>
               <w:rPr>
-                <w:highlight w:val="yellow"/>
+                <w:highlight w:val="green"/>
               </w:rPr>
-              <w:t xml:space="preserve">[ ]</w:t>
+              <w:t xml:space="preserve">6</w:t>
             </w:r>
           </w:p>
         </w:tc>
@@ -3208,9 +3208,9 @@
             </w:pPr>
             <w:r>
               <w:rPr>
-                <w:highlight w:val="yellow"/>
+                <w:highlight w:val="green"/>
               </w:rPr>
-              <w:t xml:space="preserve">[ ]</w:t>
+              <w:t xml:space="preserve">Không</w:t>
             </w:r>
           </w:p>
         </w:tc>
@@ -3529,9 +3529,9 @@
       </w:r>
       <w:r>
         <w:rPr>
-          <w:highlight w:val="yellow"/>
+          <w:highlight w:val="green"/>
         </w:rPr>
-        <w:t xml:space="preserve">[___]</w:t>
+        <w:t xml:space="preserve">5</w:t>
       </w:r>
       <w:r>
         <w:t xml:space="preserve"> phút/lần, ghi nhận thời gian gián đoạn và cảnh báo quản trị viên (phục vụ Mục tiêu 7).</w:t>
@@ -3873,18 +3873,18 @@
       </w:r>
       <w:r>
         <w:rPr>
-          <w:highlight w:val="yellow"/>
+          <w:highlight w:val="green"/>
         </w:rPr>
-        <w:t xml:space="preserve">[dd/mm/yyyy]</w:t>
+        <w:t xml:space="preserve">05/01/2026</w:t>
       </w:r>
       <w:r>
         <w:t xml:space="preserve"> – </w:t>
       </w:r>
       <w:r>
         <w:rPr>
-          <w:highlight w:val="yellow"/>
+          <w:highlight w:val="green"/>
         </w:rPr>
-        <w:t xml:space="preserve">[dd/mm/yyyy]</w:t>
+        <w:t xml:space="preserve">16/01/2026</w:t>
       </w:r>
       <w:r>
         <w:t xml:space="preserve">)</w:t>
@@ -3911,18 +3911,18 @@
       </w:r>
       <w:r>
         <w:rPr>
-          <w:highlight w:val="yellow"/>
+          <w:highlight w:val="green"/>
         </w:rPr>
-        <w:t xml:space="preserve">[dd/mm/yyyy]</w:t>
+        <w:t xml:space="preserve">19/01/2026</w:t>
       </w:r>
       <w:r>
         <w:t xml:space="preserve"> – </w:t>
       </w:r>
       <w:r>
         <w:rPr>
-          <w:highlight w:val="yellow"/>
+          <w:highlight w:val="green"/>
         </w:rPr>
-        <w:t xml:space="preserve">[dd/mm/yyyy]</w:t>
+        <w:t xml:space="preserve">27/02/2026</w:t>
       </w:r>
       <w:r>
         <w:t xml:space="preserve">)</w:t>
@@ -3949,18 +3949,18 @@
       </w:r>
       <w:r>
         <w:rPr>
-          <w:highlight w:val="yellow"/>
+          <w:highlight w:val="green"/>
         </w:rPr>
-        <w:t xml:space="preserve">[dd/mm/yyyy]</w:t>
+        <w:t xml:space="preserve">02/03/2026</w:t>
       </w:r>
       <w:r>
         <w:t xml:space="preserve"> – </w:t>
       </w:r>
       <w:r>
         <w:rPr>
-          <w:highlight w:val="yellow"/>
+          <w:highlight w:val="green"/>
         </w:rPr>
-        <w:t xml:space="preserve">[dd/mm/yyyy]</w:t>
+        <w:t xml:space="preserve">27/03/2026</w:t>
       </w:r>
       <w:r>
         <w:t xml:space="preserve">)</w:t>
@@ -3987,18 +3987,18 @@
       </w:r>
       <w:r>
         <w:rPr>
-          <w:highlight w:val="yellow"/>
+          <w:highlight w:val="green"/>
         </w:rPr>
-        <w:t xml:space="preserve">[dd/mm/yyyy]</w:t>
+        <w:t xml:space="preserve">30/03/2026</w:t>
       </w:r>
       <w:r>
         <w:t xml:space="preserve"> – </w:t>
       </w:r>
       <w:r>
         <w:rPr>
-          <w:highlight w:val="yellow"/>
+          <w:highlight w:val="green"/>
         </w:rPr>
-        <w:t xml:space="preserve">[dd/mm/yyyy]</w:t>
+        <w:t xml:space="preserve">10/04/2026</w:t>
       </w:r>
       <w:r>
         <w:t xml:space="preserve">)</w:t>
@@ -4025,9 +4025,9 @@
       </w:r>
       <w:r>
         <w:rPr>
-          <w:highlight w:val="yellow"/>
+          <w:highlight w:val="green"/>
         </w:rPr>
-        <w:t xml:space="preserve">[dd/mm/yyyy]</w:t>
+        <w:t xml:space="preserve">13/04/2026</w:t>
       </w:r>
       <w:r>
         <w:t xml:space="preserve"> – 31/12/2026):</w:t>
@@ -4052,18 +4052,18 @@
       </w:r>
       <w:r>
         <w:rPr>
-          <w:highlight w:val="yellow"/>
+          <w:highlight w:val="green"/>
         </w:rPr>
-        <w:t xml:space="preserve">[dd/mm/yyyy]</w:t>
+        <w:t xml:space="preserve">01/10/2026</w:t>
       </w:r>
       <w:r>
         <w:t xml:space="preserve"> – </w:t>
       </w:r>
       <w:r>
         <w:rPr>
-          <w:highlight w:val="yellow"/>
+          <w:highlight w:val="green"/>
         </w:rPr>
-        <w:t xml:space="preserve">[dd/mm/yyyy]</w:t>
+        <w:t xml:space="preserve">31/10/2026</w:t>
       </w:r>
       <w:r>
         <w:t xml:space="preserve">;</w:t>
@@ -4430,18 +4430,18 @@
             </w:r>
             <w:r>
               <w:rPr>
-                <w:highlight w:val="yellow"/>
+                <w:highlight w:val="green"/>
               </w:rPr>
-              <w:t xml:space="preserve">[__________]</w:t>
+              <w:t xml:space="preserve">23.029.600</w:t>
             </w:r>
             <w:r>
               <w:t xml:space="preserve"> đồng (tỷ giá bán ra Vietcombank ngày </w:t>
             </w:r>
             <w:r>
               <w:rPr>
-                <w:highlight w:val="yellow"/>
+                <w:highlight w:val="green"/>
               </w:rPr>
-              <w:t xml:space="preserve">[dd/mm/yyyy]</w:t>
+              <w:t xml:space="preserve">02/10/2026</w:t>
             </w:r>
             <w:r>
               <w:t xml:space="preserve">)</w:t>
@@ -4735,9 +4735,9 @@
             <w:r>
               <w:rPr>
                 <w:b/>
-                <w:highlight w:val="yellow"/>
+                <w:highlight w:val="green"/>
               </w:rPr>
-              <w:t xml:space="preserve">[__________]</w:t>
+              <w:t xml:space="preserve">23.029.600</w:t>
             </w:r>
             <w:r>
               <w:rPr>
@@ -4934,9 +4934,9 @@
             </w:pPr>
             <w:r>
               <w:rPr>
-                <w:highlight w:val="yellow"/>
+                <w:highlight w:val="green"/>
               </w:rPr>
-              <w:t xml:space="preserve">[dd/mm/yyyy]</w:t>
+              <w:t xml:space="preserve">13/04 – 24/04/2026</w:t>
             </w:r>
           </w:p>
         </w:tc>
@@ -5009,9 +5009,9 @@
             </w:pPr>
             <w:r>
               <w:rPr>
-                <w:highlight w:val="yellow"/>
+                <w:highlight w:val="green"/>
               </w:rPr>
-              <w:t xml:space="preserve">[dd/mm/yyyy]</w:t>
+              <w:t xml:space="preserve">13/04 – 24/04/2026</w:t>
             </w:r>
           </w:p>
         </w:tc>
@@ -5084,9 +5084,9 @@
             </w:pPr>
             <w:r>
               <w:rPr>
-                <w:highlight w:val="yellow"/>
+                <w:highlight w:val="green"/>
               </w:rPr>
-              <w:t xml:space="preserve">[dd/mm/yyyy]</w:t>
+              <w:t xml:space="preserve">27/04 – 08/05/2026</w:t>
             </w:r>
           </w:p>
         </w:tc>
@@ -5159,9 +5159,9 @@
             </w:pPr>
             <w:r>
               <w:rPr>
-                <w:highlight w:val="yellow"/>
+                <w:highlight w:val="green"/>
               </w:rPr>
-              <w:t xml:space="preserve">[dd/mm/yyyy]</w:t>
+              <w:t xml:space="preserve">11/05 – 22/05/2026</w:t>
             </w:r>
           </w:p>
         </w:tc>
@@ -5234,9 +5234,9 @@
             </w:pPr>
             <w:r>
               <w:rPr>
-                <w:highlight w:val="yellow"/>
+                <w:highlight w:val="green"/>
               </w:rPr>
-              <w:t xml:space="preserve">[dd/mm/yyyy]</w:t>
+              <w:t xml:space="preserve">25/05 – 05/06/2026</w:t>
             </w:r>
           </w:p>
         </w:tc>
@@ -5309,9 +5309,9 @@
             </w:pPr>
             <w:r>
               <w:rPr>
-                <w:highlight w:val="yellow"/>
+                <w:highlight w:val="green"/>
               </w:rPr>
-              <w:t xml:space="preserve">[dd/mm/yyyy]</w:t>
+              <w:t xml:space="preserve">08/06 – 19/06/2026</w:t>
             </w:r>
           </w:p>
         </w:tc>
@@ -5384,9 +5384,9 @@
             </w:pPr>
             <w:r>
               <w:rPr>
-                <w:highlight w:val="yellow"/>
+                <w:highlight w:val="green"/>
               </w:rPr>
-              <w:t xml:space="preserve">[dd/mm/yyyy]</w:t>
+              <w:t xml:space="preserve">15/06 – 26/06/2026</w:t>
             </w:r>
           </w:p>
         </w:tc>
@@ -5459,9 +5459,9 @@
             </w:pPr>
             <w:r>
               <w:rPr>
-                <w:highlight w:val="yellow"/>
+                <w:highlight w:val="green"/>
               </w:rPr>
-              <w:t xml:space="preserve">[dd/mm/yyyy]</w:t>
+              <w:t xml:space="preserve">22/06 – 30/06/2026</w:t>
             </w:r>
           </w:p>
         </w:tc>
@@ -7277,9 +7277,9 @@
             </w:pPr>
             <w:r>
               <w:rPr>
-                <w:highlight w:val="yellow"/>
+                <w:highlight w:val="green"/>
               </w:rPr>
-              <w:t xml:space="preserve">[ ]</w:t>
+              <w:t xml:space="preserve">0 (V2 chưa vận hành)</w:t>
             </w:r>
           </w:p>
         </w:tc>
@@ -7869,9 +7869,9 @@
             </w:pPr>
             <w:r>
               <w:rPr>
-                <w:highlight w:val="yellow"/>
+                <w:highlight w:val="green"/>
               </w:rPr>
-              <w:t xml:space="preserve">[ ]</w:t>
+              <w:t xml:space="preserve">Chưa đo (V1 không khảo sát)</w:t>
             </w:r>
           </w:p>
         </w:tc>
@@ -7988,9 +7988,9 @@
             </w:pPr>
             <w:r>
               <w:rPr>
-                <w:highlight w:val="yellow"/>
+                <w:highlight w:val="green"/>
               </w:rPr>
-              <w:t xml:space="preserve">[ ]</w:t>
+              <w:t xml:space="preserve">Chưa đo (V1 không có giám sát)</w:t>
             </w:r>
           </w:p>
         </w:tc>
@@ -8531,9 +8531,9 @@
             </w:pPr>
             <w:r>
               <w:rPr>
-                <w:highlight w:val="yellow"/>
+                <w:highlight w:val="green"/>
               </w:rPr>
-              <w:t xml:space="preserve">[ ]</w:t>
+              <w:t xml:space="preserve">P. QLCL</w:t>
             </w:r>
           </w:p>
         </w:tc>
@@ -8553,9 +8553,9 @@
             </w:pPr>
             <w:r>
               <w:rPr>
-                <w:highlight w:val="yellow"/>
+                <w:highlight w:val="green"/>
               </w:rPr>
-              <w:t xml:space="preserve">[ ]</w:t>
+              <w:t xml:space="preserve">05/01/2026</w:t>
             </w:r>
           </w:p>
         </w:tc>
@@ -8575,9 +8575,9 @@
             </w:pPr>
             <w:r>
               <w:rPr>
-                <w:highlight w:val="yellow"/>
+                <w:highlight w:val="green"/>
               </w:rPr>
-              <w:t xml:space="preserve">[ ]</w:t>
+              <w:t xml:space="preserve">16/01/2026</w:t>
             </w:r>
           </w:p>
         </w:tc>
@@ -8787,9 +8787,9 @@
             </w:pPr>
             <w:r>
               <w:rPr>
-                <w:highlight w:val="yellow"/>
+                <w:highlight w:val="green"/>
               </w:rPr>
-              <w:t xml:space="preserve">[ ]</w:t>
+              <w:t xml:space="preserve">P. QLCL</w:t>
             </w:r>
           </w:p>
         </w:tc>
@@ -8809,9 +8809,9 @@
             </w:pPr>
             <w:r>
               <w:rPr>
-                <w:highlight w:val="yellow"/>
+                <w:highlight w:val="green"/>
               </w:rPr>
-              <w:t xml:space="preserve">[ ]</w:t>
+              <w:t xml:space="preserve">05/01/2026</w:t>
             </w:r>
           </w:p>
         </w:tc>
@@ -8831,9 +8831,9 @@
             </w:pPr>
             <w:r>
               <w:rPr>
-                <w:highlight w:val="yellow"/>
+                <w:highlight w:val="green"/>
               </w:rPr>
-              <w:t xml:space="preserve">[ ]</w:t>
+              <w:t xml:space="preserve">16/01/2026</w:t>
             </w:r>
           </w:p>
         </w:tc>
@@ -9043,9 +9043,9 @@
             </w:pPr>
             <w:r>
               <w:rPr>
-                <w:highlight w:val="yellow"/>
+                <w:highlight w:val="green"/>
               </w:rPr>
-              <w:t xml:space="preserve">[ ]</w:t>
+              <w:t xml:space="preserve">P. QLCL</w:t>
             </w:r>
           </w:p>
         </w:tc>
@@ -9065,9 +9065,9 @@
             </w:pPr>
             <w:r>
               <w:rPr>
-                <w:highlight w:val="yellow"/>
+                <w:highlight w:val="green"/>
               </w:rPr>
-              <w:t xml:space="preserve">[ ]</w:t>
+              <w:t xml:space="preserve">05/01/2026</w:t>
             </w:r>
           </w:p>
         </w:tc>
@@ -9087,9 +9087,9 @@
             </w:pPr>
             <w:r>
               <w:rPr>
-                <w:highlight w:val="yellow"/>
+                <w:highlight w:val="green"/>
               </w:rPr>
-              <w:t xml:space="preserve">[ ]</w:t>
+              <w:t xml:space="preserve">16/01/2026</w:t>
             </w:r>
           </w:p>
         </w:tc>
@@ -9299,9 +9299,9 @@
             </w:pPr>
             <w:r>
               <w:rPr>
-                <w:highlight w:val="yellow"/>
+                <w:highlight w:val="green"/>
               </w:rPr>
-              <w:t xml:space="preserve">[ ]</w:t>
+              <w:t xml:space="preserve">P. QLCL</w:t>
             </w:r>
           </w:p>
         </w:tc>
@@ -9321,9 +9321,9 @@
             </w:pPr>
             <w:r>
               <w:rPr>
-                <w:highlight w:val="yellow"/>
+                <w:highlight w:val="green"/>
               </w:rPr>
-              <w:t xml:space="preserve">[ ]</w:t>
+              <w:t xml:space="preserve">19/01/2026</w:t>
             </w:r>
           </w:p>
         </w:tc>
@@ -9343,9 +9343,9 @@
             </w:pPr>
             <w:r>
               <w:rPr>
-                <w:highlight w:val="yellow"/>
+                <w:highlight w:val="green"/>
               </w:rPr>
-              <w:t xml:space="preserve">[ ]</w:t>
+              <w:t xml:space="preserve">27/02/2026</w:t>
             </w:r>
           </w:p>
         </w:tc>
@@ -9490,9 +9490,9 @@
             </w:r>
             <w:r>
               <w:rPr>
-                <w:highlight w:val="yellow"/>
+                <w:highlight w:val="green"/>
               </w:rPr>
-              <w:t xml:space="preserve">[______]</w:t>
+              <w:t xml:space="preserve">23.029.600</w:t>
             </w:r>
             <w:r>
               <w:t xml:space="preserve"> đồng (Claude Code)</w:t>
@@ -9568,9 +9568,9 @@
             </w:pPr>
             <w:r>
               <w:rPr>
-                <w:highlight w:val="yellow"/>
+                <w:highlight w:val="green"/>
               </w:rPr>
-              <w:t xml:space="preserve">[ ]</w:t>
+              <w:t xml:space="preserve">P. QLCL</w:t>
             </w:r>
           </w:p>
         </w:tc>
@@ -9590,9 +9590,9 @@
             </w:pPr>
             <w:r>
               <w:rPr>
-                <w:highlight w:val="yellow"/>
+                <w:highlight w:val="green"/>
               </w:rPr>
-              <w:t xml:space="preserve">[ ]</w:t>
+              <w:t xml:space="preserve">02/02/2026</w:t>
             </w:r>
           </w:p>
         </w:tc>
@@ -9612,9 +9612,9 @@
             </w:pPr>
             <w:r>
               <w:rPr>
-                <w:highlight w:val="yellow"/>
+                <w:highlight w:val="green"/>
               </w:rPr>
-              <w:t xml:space="preserve">[ ]</w:t>
+              <w:t xml:space="preserve">27/03/2026</w:t>
             </w:r>
           </w:p>
         </w:tc>
@@ -9825,9 +9825,9 @@
             </w:pPr>
             <w:r>
               <w:rPr>
-                <w:highlight w:val="yellow"/>
+                <w:highlight w:val="green"/>
               </w:rPr>
-              <w:t xml:space="preserve">[ ]</w:t>
+              <w:t xml:space="preserve">P. QLCL</w:t>
             </w:r>
           </w:p>
         </w:tc>
@@ -9847,9 +9847,9 @@
             </w:pPr>
             <w:r>
               <w:rPr>
-                <w:highlight w:val="yellow"/>
+                <w:highlight w:val="green"/>
               </w:rPr>
-              <w:t xml:space="preserve">[ ]</w:t>
+              <w:t xml:space="preserve">02/03/2026</w:t>
             </w:r>
           </w:p>
         </w:tc>
@@ -9869,9 +9869,9 @@
             </w:pPr>
             <w:r>
               <w:rPr>
-                <w:highlight w:val="yellow"/>
+                <w:highlight w:val="green"/>
               </w:rPr>
-              <w:t xml:space="preserve">[ ]</w:t>
+              <w:t xml:space="preserve">27/03/2026</w:t>
             </w:r>
           </w:p>
         </w:tc>
@@ -10081,9 +10081,9 @@
             </w:pPr>
             <w:r>
               <w:rPr>
-                <w:highlight w:val="yellow"/>
+                <w:highlight w:val="green"/>
               </w:rPr>
-              <w:t xml:space="preserve">[ ]</w:t>
+              <w:t xml:space="preserve">P. QLCL</w:t>
             </w:r>
           </w:p>
         </w:tc>
@@ -10103,9 +10103,9 @@
             </w:pPr>
             <w:r>
               <w:rPr>
-                <w:highlight w:val="yellow"/>
+                <w:highlight w:val="green"/>
               </w:rPr>
-              <w:t xml:space="preserve">[ ]</w:t>
+              <w:t xml:space="preserve">30/03/2026</w:t>
             </w:r>
           </w:p>
         </w:tc>
@@ -10125,9 +10125,9 @@
             </w:pPr>
             <w:r>
               <w:rPr>
-                <w:highlight w:val="yellow"/>
+                <w:highlight w:val="green"/>
               </w:rPr>
-              <w:t xml:space="preserve">[ ]</w:t>
+              <w:t xml:space="preserve">10/04/2026</w:t>
             </w:r>
           </w:p>
         </w:tc>
@@ -10337,9 +10337,9 @@
             </w:pPr>
             <w:r>
               <w:rPr>
-                <w:highlight w:val="yellow"/>
+                <w:highlight w:val="green"/>
               </w:rPr>
-              <w:t xml:space="preserve">[ ]</w:t>
+              <w:t xml:space="preserve">P. QLCL</w:t>
             </w:r>
           </w:p>
         </w:tc>
@@ -10359,9 +10359,9 @@
             </w:pPr>
             <w:r>
               <w:rPr>
-                <w:highlight w:val="yellow"/>
+                <w:highlight w:val="green"/>
               </w:rPr>
-              <w:t xml:space="preserve">[ ]</w:t>
+              <w:t xml:space="preserve">13/04/2026</w:t>
             </w:r>
           </w:p>
         </w:tc>
@@ -10381,9 +10381,9 @@
             </w:pPr>
             <w:r>
               <w:rPr>
-                <w:highlight w:val="yellow"/>
+                <w:highlight w:val="green"/>
               </w:rPr>
-              <w:t xml:space="preserve">[ ]</w:t>
+              <w:t xml:space="preserve">30/06/2026</w:t>
             </w:r>
           </w:p>
         </w:tc>
@@ -10595,9 +10595,9 @@
             </w:pPr>
             <w:r>
               <w:rPr>
-                <w:highlight w:val="yellow"/>
+                <w:highlight w:val="green"/>
               </w:rPr>
-              <w:t xml:space="preserve">[ ]</w:t>
+              <w:t xml:space="preserve">P. QLCL</w:t>
             </w:r>
           </w:p>
         </w:tc>
@@ -10617,9 +10617,9 @@
             </w:pPr>
             <w:r>
               <w:rPr>
-                <w:highlight w:val="yellow"/>
+                <w:highlight w:val="green"/>
               </w:rPr>
-              <w:t xml:space="preserve">[ ]</w:t>
+              <w:t xml:space="preserve">01/10/2026</w:t>
             </w:r>
           </w:p>
         </w:tc>
@@ -10639,9 +10639,9 @@
             </w:pPr>
             <w:r>
               <w:rPr>
-                <w:highlight w:val="yellow"/>
+                <w:highlight w:val="green"/>
               </w:rPr>
-              <w:t xml:space="preserve">[ ]</w:t>
+              <w:t xml:space="preserve">31/10/2026</w:t>
             </w:r>
           </w:p>
         </w:tc>
@@ -10851,9 +10851,9 @@
             </w:pPr>
             <w:r>
               <w:rPr>
-                <w:highlight w:val="yellow"/>
+                <w:highlight w:val="green"/>
               </w:rPr>
-              <w:t xml:space="preserve">[ ]</w:t>
+              <w:t xml:space="preserve">P. QLCL</w:t>
             </w:r>
           </w:p>
         </w:tc>
@@ -10873,9 +10873,9 @@
             </w:pPr>
             <w:r>
               <w:rPr>
-                <w:highlight w:val="yellow"/>
+                <w:highlight w:val="green"/>
               </w:rPr>
-              <w:t xml:space="preserve">[ ]</w:t>
+              <w:t xml:space="preserve">01/10/2026</w:t>
             </w:r>
           </w:p>
         </w:tc>
@@ -10895,9 +10895,9 @@
             </w:pPr>
             <w:r>
               <w:rPr>
-                <w:highlight w:val="yellow"/>
+                <w:highlight w:val="green"/>
               </w:rPr>
-              <w:t xml:space="preserve">[ ]</w:t>
+              <w:t xml:space="preserve">15/10/2026</w:t>
             </w:r>
           </w:p>
         </w:tc>
@@ -11107,9 +11107,9 @@
             </w:pPr>
             <w:r>
               <w:rPr>
-                <w:highlight w:val="yellow"/>
+                <w:highlight w:val="green"/>
               </w:rPr>
-              <w:t xml:space="preserve">[ ]</w:t>
+              <w:t xml:space="preserve">P. QLCL</w:t>
             </w:r>
           </w:p>
         </w:tc>
@@ -11129,9 +11129,9 @@
             </w:pPr>
             <w:r>
               <w:rPr>
-                <w:highlight w:val="yellow"/>
+                <w:highlight w:val="green"/>
               </w:rPr>
-              <w:t xml:space="preserve">[ ]</w:t>
+              <w:t xml:space="preserve">15/06/2026</w:t>
             </w:r>
           </w:p>
         </w:tc>
@@ -11151,9 +11151,9 @@
             </w:pPr>
             <w:r>
               <w:rPr>
-                <w:highlight w:val="yellow"/>
+                <w:highlight w:val="green"/>
               </w:rPr>
-              <w:t xml:space="preserve">[ ]</w:t>
+              <w:t xml:space="preserve">15/12/2026</w:t>
             </w:r>
           </w:p>
         </w:tc>
@@ -11365,9 +11365,9 @@
             </w:pPr>
             <w:r>
               <w:rPr>
-                <w:highlight w:val="yellow"/>
+                <w:highlight w:val="green"/>
               </w:rPr>
-              <w:t xml:space="preserve">[ ]</w:t>
+              <w:t xml:space="preserve">P. QLCL</w:t>
             </w:r>
           </w:p>
         </w:tc>
@@ -11387,9 +11387,9 @@
             </w:pPr>
             <w:r>
               <w:rPr>
-                <w:highlight w:val="yellow"/>
+                <w:highlight w:val="green"/>
               </w:rPr>
-              <w:t xml:space="preserve">[ ]</w:t>
+              <w:t xml:space="preserve">01/05/2026</w:t>
             </w:r>
           </w:p>
         </w:tc>
@@ -11409,9 +11409,9 @@
             </w:pPr>
             <w:r>
               <w:rPr>
-                <w:highlight w:val="yellow"/>
+                <w:highlight w:val="green"/>
               </w:rPr>
-              <w:t xml:space="preserve">[ ]</w:t>
+              <w:t xml:space="preserve">31/12/2026</w:t>
             </w:r>
           </w:p>
         </w:tc>
@@ -11628,9 +11628,9 @@
             </w:pPr>
             <w:r>
               <w:rPr>
-                <w:highlight w:val="yellow"/>
+                <w:highlight w:val="green"/>
               </w:rPr>
-              <w:t xml:space="preserve">[ ]</w:t>
+              <w:t xml:space="preserve">P. QLCL</w:t>
             </w:r>
           </w:p>
         </w:tc>
@@ -11650,9 +11650,9 @@
             </w:pPr>
             <w:r>
               <w:rPr>
-                <w:highlight w:val="yellow"/>
+                <w:highlight w:val="green"/>
               </w:rPr>
-              <w:t xml:space="preserve">[ ]</w:t>
+              <w:t xml:space="preserve">05/01/2026</w:t>
             </w:r>
           </w:p>
         </w:tc>
@@ -11672,9 +11672,9 @@
             </w:pPr>
             <w:r>
               <w:rPr>
-                <w:highlight w:val="yellow"/>
+                <w:highlight w:val="green"/>
               </w:rPr>
-              <w:t xml:space="preserve">[ ]</w:t>
+              <w:t xml:space="preserve">31/12/2026</w:t>
             </w:r>
           </w:p>
         </w:tc>
@@ -11895,9 +11895,9 @@
             </w:pPr>
             <w:r>
               <w:rPr>
-                <w:highlight w:val="yellow"/>
+                <w:highlight w:val="green"/>
               </w:rPr>
-              <w:t xml:space="preserve">[ ]</w:t>
+              <w:t xml:space="preserve">P. QLCL</w:t>
             </w:r>
           </w:p>
         </w:tc>
@@ -11917,9 +11917,9 @@
             </w:pPr>
             <w:r>
               <w:rPr>
-                <w:highlight w:val="yellow"/>
+                <w:highlight w:val="green"/>
               </w:rPr>
-              <w:t xml:space="preserve">[ ]</w:t>
+              <w:t xml:space="preserve">01/12/2026</w:t>
             </w:r>
           </w:p>
         </w:tc>
@@ -11939,9 +11939,9 @@
             </w:pPr>
             <w:r>
               <w:rPr>
-                <w:highlight w:val="yellow"/>
+                <w:highlight w:val="green"/>
               </w:rPr>
-              <w:t xml:space="preserve">[ ]</w:t>
+              <w:t xml:space="preserve">15/01/2027</w:t>
             </w:r>
           </w:p>
         </w:tc>

</xml_diff>